<commit_message>
Expand use case diagram explanations for Feature 5
</commit_message>
<xml_diff>
--- a/N13 Nhóm 01.docx
+++ b/N13 Nhóm 01.docx
@@ -4938,6 +4938,42 @@
         <w:t>Hình 2.6: Biểu đồ Use Case chi tiết - Chức năng Xem thống kê doanh thu sự kiện</w:t>
       </w:r>
     </w:p>
+    <w:p>
+      <w:pPr>
+        <w:spacing w:before="0" w:after="100" w:line="300" w:lineRule="auto"/>
+      </w:pPr>
+      <w:r>
+        <w:rPr>
+          <w:rFonts w:ascii="Times New Roman" w:hAnsi="Times New Roman"/>
+          <w:b/>
+          <w:color w:val="0F172A"/>
+          <w:sz w:val="23"/>
+        </w:rPr>
+        <w:t xml:space="preserve">Giải thích nội dung biểu đồ: </w:t>
+      </w:r>
+      <w:r>
+        <w:rPr>
+          <w:rFonts w:ascii="Times New Roman" w:hAnsi="Times New Roman"/>
+          <w:color w:val="1E293B"/>
+          <w:sz w:val="23"/>
+        </w:rPr>
+        <w:t>Biểu đồ Use Case chức năng 5 mô tả chi tiết ranh giới hệ thống thống kê doanh thu và cách thức các tác nhân tương tác thông qua 2 loại quan hệ cấu trúc chuẩn UML:</w:t>
+        <w:br/>
+        <w:t>1. Quan hệ Bao hàm (&lt;&lt;include&gt;&gt;):</w:t>
+        <w:br/>
+        <w:t xml:space="preserve">   - 'Chọn sự kiện cần thống kê': Đây là hành động bắt buộc của người dùng. Hệ thống cần định danh chính xác mã sự kiện (eventId) làm tiền đề nạp đúng cấu trúc sơ đồ ghế, suất diễn và danh sách đơn hàng tương ứng để phục vụ tính toán.</w:t>
+        <w:br/>
+        <w:t xml:space="preserve">   - 'Tổng hợp và tính toán KPIs (Doanh thu và tỉ lệ lấp đầy)': Là chuỗi thuật toán tự động bắt buộc do hệ thống thực thi ngay khi người dùng bấm nút tra cứu. Hệ thống sẽ quét toàn bộ dữ liệu đơn hàng và thực hiện các hàm tính toán tài chính (Gross/Net Revenue, Occupancy Rate) để đảm bảo số liệu hiển thị luôn chính xác theo thời gian thực.</w:t>
+        <w:br/>
+        <w:t>2. Quan hệ Mở rộng (&lt;&lt;extend&gt;&gt;): Định nghĩa 3 hành vi phân tích tùy chọn chỉ được kích hoạt dựa trên các điểm mở rộng (extension points) cụ thể tại use case trung tâm:</w:t>
+        <w:br/>
+        <w:t xml:space="preserve">   - 'Lọc theo suất diễn và khoảng ngày': Kích hoạt khi Ban tổ chức có nhu cầu phân tích thu hẹp phạm vi dữ liệu theo từng đêm diễn cụ thể hoặc lọc sâu theo giai đoạn mở bán vé.</w:t>
+        <w:br/>
+        <w:t xml:space="preserve">   - 'Xem chi tiết phân bổ doanh thu theo phân khu': Kích hoạt khi Ban tổ chức cần xem biểu đồ trực quan biểu diễn tỷ trọng đóng góp tài chính của từng hạng vé (VIP, CAT 1, CAT 2, Standing) so với tổng doanh thu gộp.</w:t>
+        <w:br/>
+        <w:t xml:space="preserve">   - 'Xuất báo cáo doanh thu': Kích hoạt khi người dùng muốn lưu trữ báo cáo ngoại tuyến dưới dạng tệp Excel hoặc in PDF để báo cáo nội bộ.</w:t>
+      </w:r>
+    </w:p>
     <w:tbl>
       <w:tblPr>
         <w:tblW w:type="auto" w:w="0"/>
@@ -7659,7 +7695,20 @@
           <w:color w:val="1D4ED8"/>
           <w:sz w:val="25"/>
         </w:rPr>
-        <w:t>4.2. Kịch bản tương tác người dùng - hệ thống (UI Interaction Scenario)</w:t>
+        <w:t>4.2. Kịch bản tương tác giao diện chi tiết (UI Storyboard Scenario)</w:t>
+      </w:r>
+    </w:p>
+    <w:p>
+      <w:pPr>
+        <w:spacing w:before="0" w:after="100" w:line="300" w:lineRule="auto"/>
+      </w:pPr>
+      <w:r>
+        <w:rPr>
+          <w:rFonts w:ascii="Times New Roman" w:hAnsi="Times New Roman"/>
+          <w:color w:val="1E293B"/>
+          <w:sz w:val="23"/>
+        </w:rPr>
+        <w:t>Kịch bản tương tác giao diện mô tả chi tiết từng bước hành động của người dùng trên màn hình RevenueReportView, sự kiện kích hoạt, cách thức hệ thống xử lý nghiệp vụ và phản hồi hiển thị tương ứng:</w:t>
       </w:r>
     </w:p>
     <w:tbl>
@@ -7677,14 +7726,16 @@
         </w:tblBorders>
       </w:tblPr>
       <w:tblGrid>
-        <w:gridCol w:w="3134"/>
-        <w:gridCol w:w="3134"/>
-        <w:gridCol w:w="3134"/>
+        <w:gridCol w:w="1881"/>
+        <w:gridCol w:w="1881"/>
+        <w:gridCol w:w="1881"/>
+        <w:gridCol w:w="1881"/>
+        <w:gridCol w:w="1881"/>
       </w:tblGrid>
       <w:tr>
         <w:tc>
           <w:tcPr>
-            <w:tcW w:type="dxa" w:w="864"/>
+            <w:tcW w:type="dxa" w:w="720"/>
             <w:shd w:fill="1E3A8A"/>
             <w:tcMar>
               <w:top w:w="140" w:type="dxa"/>
@@ -7710,7 +7761,7 @@
         </w:tc>
         <w:tc>
           <w:tcPr>
-            <w:tcW w:type="dxa" w:w="4176"/>
+            <w:tcW w:type="dxa" w:w="2592"/>
             <w:shd w:fill="1E3A8A"/>
             <w:tcMar>
               <w:top w:w="140" w:type="dxa"/>
@@ -7730,13 +7781,13 @@
                 <w:color w:val="FFFFFF"/>
                 <w:sz w:val="21"/>
               </w:rPr>
-              <w:t>Hành động của người dùng (User Action)</w:t>
-            </w:r>
-          </w:p>
-        </w:tc>
-        <w:tc>
-          <w:tcPr>
-            <w:tcW w:type="dxa" w:w="4320"/>
+              <w:t>Hành động của tác nhân (User Action)</w:t>
+            </w:r>
+          </w:p>
+        </w:tc>
+        <w:tc>
+          <w:tcPr>
+            <w:tcW w:type="dxa" w:w="1584"/>
             <w:shd w:fill="1E3A8A"/>
             <w:tcMar>
               <w:top w:w="140" w:type="dxa"/>
@@ -7756,7 +7807,59 @@
                 <w:color w:val="FFFFFF"/>
                 <w:sz w:val="21"/>
               </w:rPr>
-              <w:t>Phản hồi của hệ thống (System Response)</w:t>
+              <w:t>Sự kiện UI (Event)</w:t>
+            </w:r>
+          </w:p>
+        </w:tc>
+        <w:tc>
+          <w:tcPr>
+            <w:tcW w:type="dxa" w:w="3312"/>
+            <w:shd w:fill="1E3A8A"/>
+            <w:tcMar>
+              <w:top w:w="140" w:type="dxa"/>
+              <w:bottom w:w="140" w:type="dxa"/>
+              <w:left w:w="160" w:type="dxa"/>
+              <w:right w:w="160" w:type="dxa"/>
+            </w:tcMar>
+          </w:tcPr>
+          <w:p>
+            <w:pPr>
+              <w:jc w:val="center"/>
+            </w:pPr>
+            <w:r>
+              <w:rPr>
+                <w:rFonts w:ascii="Times New Roman" w:hAnsi="Times New Roman"/>
+                <w:b/>
+                <w:color w:val="FFFFFF"/>
+                <w:sz w:val="21"/>
+              </w:rPr>
+              <w:t>Xử lý hệ thống &amp; Phản hồi giao diện (System Response)</w:t>
+            </w:r>
+          </w:p>
+        </w:tc>
+        <w:tc>
+          <w:tcPr>
+            <w:tcW w:type="dxa" w:w="1872"/>
+            <w:shd w:fill="1E3A8A"/>
+            <w:tcMar>
+              <w:top w:w="140" w:type="dxa"/>
+              <w:bottom w:w="140" w:type="dxa"/>
+              <w:left w:w="160" w:type="dxa"/>
+              <w:right w:w="160" w:type="dxa"/>
+            </w:tcMar>
+          </w:tcPr>
+          <w:p>
+            <w:pPr>
+              <w:jc w:val="center"/>
+            </w:pPr>
+            <w:r>
+              <w:rPr>
+                <w:rFonts w:ascii="Times New Roman" w:hAnsi="Times New Roman"/>
+                <w:b/>
+                <w:color w:val="FFFFFF"/>
+                <w:sz w:val="21"/>
+              </w:rPr>
+              <w:t>Trạng thái giao diện tiếp theo (Next State)</w:t>
             </w:r>
           </w:p>
         </w:tc>
@@ -7764,7 +7867,7 @@
       <w:tr>
         <w:tc>
           <w:tcPr>
-            <w:tcW w:type="dxa" w:w="864"/>
+            <w:tcW w:type="dxa" w:w="720"/>
             <w:shd w:fill="FFFFFF"/>
             <w:tcMar>
               <w:top w:w="100" w:type="dxa"/>
@@ -7789,7 +7892,7 @@
         </w:tc>
         <w:tc>
           <w:tcPr>
-            <w:tcW w:type="dxa" w:w="4176"/>
+            <w:tcW w:type="dxa" w:w="2592"/>
             <w:shd w:fill="FFFFFF"/>
             <w:tcMar>
               <w:top w:w="100" w:type="dxa"/>
@@ -7808,13 +7911,13 @@
                 <w:color w:val="1E293B"/>
                 <w:sz w:val="20"/>
               </w:rPr>
-              <w:t>Người dùng truy cập vào mục 'Thống kê doanh thu' từ menu.</w:t>
-            </w:r>
-          </w:p>
-        </w:tc>
-        <w:tc>
-          <w:tcPr>
-            <w:tcW w:type="dxa" w:w="4320"/>
+              <w:t>Người dùng nhấp chọn mục 'Thống kê doanh thu' trên menu điều khiển.</w:t>
+            </w:r>
+          </w:p>
+        </w:tc>
+        <w:tc>
+          <w:tcPr>
+            <w:tcW w:type="dxa" w:w="1584"/>
             <w:shd w:fill="FFFFFF"/>
             <w:tcMar>
               <w:top w:w="100" w:type="dxa"/>
@@ -7833,7 +7936,57 @@
                 <w:color w:val="1E293B"/>
                 <w:sz w:val="20"/>
               </w:rPr>
-              <w:t>Hệ thống tải giao diện RevenueReportView, nạp danh sách các sự kiện vào ComboBox, đặt khoảng ngày mặc định là 30 ngày gần nhất.</w:t>
+              <w:t>OnClick (Menu_ThongKe)</w:t>
+            </w:r>
+          </w:p>
+        </w:tc>
+        <w:tc>
+          <w:tcPr>
+            <w:tcW w:type="dxa" w:w="3312"/>
+            <w:shd w:fill="FFFFFF"/>
+            <w:tcMar>
+              <w:top w:w="100" w:type="dxa"/>
+              <w:bottom w:w="100" w:type="dxa"/>
+              <w:left w:w="140" w:type="dxa"/>
+              <w:right w:w="140" w:type="dxa"/>
+            </w:tcMar>
+          </w:tcPr>
+          <w:p>
+            <w:pPr>
+              <w:jc w:val="left"/>
+            </w:pPr>
+            <w:r>
+              <w:rPr>
+                <w:rFonts w:ascii="Times New Roman" w:hAnsi="Times New Roman"/>
+                <w:color w:val="1E293B"/>
+                <w:sz w:val="20"/>
+              </w:rPr>
+              <w:t>Hệ thống gọi API lấy danh sách các sự kiện đang hoạt động. Khởi tạo màn hình RevenueReportView, nạp danh sách sự kiện vào ComboBox (cb_event), đặt khoảng ngày tra cứu mặc định là 30 ngày gần nhất.</w:t>
+            </w:r>
+          </w:p>
+        </w:tc>
+        <w:tc>
+          <w:tcPr>
+            <w:tcW w:type="dxa" w:w="1872"/>
+            <w:shd w:fill="FFFFFF"/>
+            <w:tcMar>
+              <w:top w:w="100" w:type="dxa"/>
+              <w:bottom w:w="100" w:type="dxa"/>
+              <w:left w:w="140" w:type="dxa"/>
+              <w:right w:w="140" w:type="dxa"/>
+            </w:tcMar>
+          </w:tcPr>
+          <w:p>
+            <w:pPr>
+              <w:jc w:val="left"/>
+            </w:pPr>
+            <w:r>
+              <w:rPr>
+                <w:rFonts w:ascii="Times New Roman" w:hAnsi="Times New Roman"/>
+                <w:color w:val="1E293B"/>
+                <w:sz w:val="20"/>
+              </w:rPr>
+              <w:t>Màn hình hiển thị trống (Ready): Bộ lọc sẵn sàng, các thẻ KPI và bảng biểu ở trạng thái chờ.</w:t>
             </w:r>
           </w:p>
         </w:tc>
@@ -7841,7 +7994,7 @@
       <w:tr>
         <w:tc>
           <w:tcPr>
-            <w:tcW w:type="dxa" w:w="864"/>
+            <w:tcW w:type="dxa" w:w="720"/>
             <w:shd w:fill="F8FAFC"/>
             <w:tcMar>
               <w:top w:w="100" w:type="dxa"/>
@@ -7866,7 +8019,7 @@
         </w:tc>
         <w:tc>
           <w:tcPr>
-            <w:tcW w:type="dxa" w:w="4176"/>
+            <w:tcW w:type="dxa" w:w="2592"/>
             <w:shd w:fill="F8FAFC"/>
             <w:tcMar>
               <w:top w:w="100" w:type="dxa"/>
@@ -7891,7 +8044,7 @@
         </w:tc>
         <w:tc>
           <w:tcPr>
-            <w:tcW w:type="dxa" w:w="4320"/>
+            <w:tcW w:type="dxa" w:w="1584"/>
             <w:shd w:fill="F8FAFC"/>
             <w:tcMar>
               <w:top w:w="100" w:type="dxa"/>
@@ -7910,7 +8063,57 @@
                 <w:color w:val="1E293B"/>
                 <w:sz w:val="20"/>
               </w:rPr>
-              <w:t>Hệ thống ghi nhận mã sự kiện eventId, tự động cập nhật ngày mở bán và ngày kết thúc sự kiện vào 2 ô DatePicker.</w:t>
+              <w:t>OnSelectionChange (cb_event)</w:t>
+            </w:r>
+          </w:p>
+        </w:tc>
+        <w:tc>
+          <w:tcPr>
+            <w:tcW w:type="dxa" w:w="3312"/>
+            <w:shd w:fill="F8FAFC"/>
+            <w:tcMar>
+              <w:top w:w="100" w:type="dxa"/>
+              <w:bottom w:w="100" w:type="dxa"/>
+              <w:left w:w="140" w:type="dxa"/>
+              <w:right w:w="140" w:type="dxa"/>
+            </w:tcMar>
+          </w:tcPr>
+          <w:p>
+            <w:pPr>
+              <w:jc w:val="left"/>
+            </w:pPr>
+            <w:r>
+              <w:rPr>
+                <w:rFonts w:ascii="Times New Roman" w:hAnsi="Times New Roman"/>
+                <w:color w:val="1E293B"/>
+                <w:sz w:val="20"/>
+              </w:rPr>
+              <w:t>Hệ thống ghi nhận mã sự kiện eventId, tự động truy vấn khoảng thời gian diễn ra sự kiện trong CSDL và điền sẵn vào 2 ô DatePicker dp_from_date và dp_to_date.</w:t>
+            </w:r>
+          </w:p>
+        </w:tc>
+        <w:tc>
+          <w:tcPr>
+            <w:tcW w:type="dxa" w:w="1872"/>
+            <w:shd w:fill="F8FAFC"/>
+            <w:tcMar>
+              <w:top w:w="100" w:type="dxa"/>
+              <w:bottom w:w="100" w:type="dxa"/>
+              <w:left w:w="140" w:type="dxa"/>
+              <w:right w:w="140" w:type="dxa"/>
+            </w:tcMar>
+          </w:tcPr>
+          <w:p>
+            <w:pPr>
+              <w:jc w:val="left"/>
+            </w:pPr>
+            <w:r>
+              <w:rPr>
+                <w:rFonts w:ascii="Times New Roman" w:hAnsi="Times New Roman"/>
+                <w:color w:val="1E293B"/>
+                <w:sz w:val="20"/>
+              </w:rPr>
+              <w:t>Đã nạp bộ lọc (Configured): ComboBox hiển thị sự kiện đã chọn, các ô ngày hiển thị khoảng ngày của sự kiện.</w:t>
             </w:r>
           </w:p>
         </w:tc>
@@ -7918,7 +8121,7 @@
       <w:tr>
         <w:tc>
           <w:tcPr>
-            <w:tcW w:type="dxa" w:w="864"/>
+            <w:tcW w:type="dxa" w:w="720"/>
             <w:shd w:fill="FFFFFF"/>
             <w:tcMar>
               <w:top w:w="100" w:type="dxa"/>
@@ -7943,7 +8146,7 @@
         </w:tc>
         <w:tc>
           <w:tcPr>
-            <w:tcW w:type="dxa" w:w="4176"/>
+            <w:tcW w:type="dxa" w:w="2592"/>
             <w:shd w:fill="FFFFFF"/>
             <w:tcMar>
               <w:top w:w="100" w:type="dxa"/>
@@ -7962,13 +8165,13 @@
                 <w:color w:val="1E293B"/>
                 <w:sz w:val="20"/>
               </w:rPr>
-              <w:t>Người dùng nhấp nút 'Tra cứu' (btn_search).</w:t>
-            </w:r>
-          </w:p>
-        </w:tc>
-        <w:tc>
-          <w:tcPr>
-            <w:tcW w:type="dxa" w:w="4320"/>
+              <w:t>Người dùng điều chỉnh ô ngày và nhấp chuột vào nút 'Tra cứu' (btn_search).</w:t>
+            </w:r>
+          </w:p>
+        </w:tc>
+        <w:tc>
+          <w:tcPr>
+            <w:tcW w:type="dxa" w:w="1584"/>
             <w:shd w:fill="FFFFFF"/>
             <w:tcMar>
               <w:top w:w="100" w:type="dxa"/>
@@ -7987,7 +8190,57 @@
                 <w:color w:val="1E293B"/>
                 <w:sz w:val="20"/>
               </w:rPr>
-              <w:t>Giao diện hiển thị biểu tượng tải dữ liệu (loading spinner). Controller nạp Entity RevenueReport, kích hoạt chuỗi tính toán và trả về RevenueSummaryDto.</w:t>
+              <w:t>OnClick (btn_search)</w:t>
+            </w:r>
+          </w:p>
+        </w:tc>
+        <w:tc>
+          <w:tcPr>
+            <w:tcW w:type="dxa" w:w="3312"/>
+            <w:shd w:fill="FFFFFF"/>
+            <w:tcMar>
+              <w:top w:w="100" w:type="dxa"/>
+              <w:bottom w:w="100" w:type="dxa"/>
+              <w:left w:w="140" w:type="dxa"/>
+              <w:right w:w="140" w:type="dxa"/>
+            </w:tcMar>
+          </w:tcPr>
+          <w:p>
+            <w:pPr>
+              <w:jc w:val="left"/>
+            </w:pPr>
+            <w:r>
+              <w:rPr>
+                <w:rFonts w:ascii="Times New Roman" w:hAnsi="Times New Roman"/>
+                <w:color w:val="1E293B"/>
+                <w:sz w:val="20"/>
+              </w:rPr>
+              <w:t>Giao diện vô hiệu hóa tạm thời bộ lọc (disable cb_event, btn_search) và hiển thị vòng xoay tải dữ liệu (loading spinner). Gửi yêu cầu truy vấn tài chính tới RevenueReportController.</w:t>
+            </w:r>
+          </w:p>
+        </w:tc>
+        <w:tc>
+          <w:tcPr>
+            <w:tcW w:type="dxa" w:w="1872"/>
+            <w:shd w:fill="FFFFFF"/>
+            <w:tcMar>
+              <w:top w:w="100" w:type="dxa"/>
+              <w:bottom w:w="100" w:type="dxa"/>
+              <w:left w:w="140" w:type="dxa"/>
+              <w:right w:w="140" w:type="dxa"/>
+            </w:tcMar>
+          </w:tcPr>
+          <w:p>
+            <w:pPr>
+              <w:jc w:val="left"/>
+            </w:pPr>
+            <w:r>
+              <w:rPr>
+                <w:rFonts w:ascii="Times New Roman" w:hAnsi="Times New Roman"/>
+                <w:color w:val="1E293B"/>
+                <w:sz w:val="20"/>
+              </w:rPr>
+              <w:t>Đang xử lý (Loading): Biểu tượng xoay hiển thị, người dùng không thể nhấp lại nút tra cứu.</w:t>
             </w:r>
           </w:p>
         </w:tc>
@@ -7995,7 +8248,7 @@
       <w:tr>
         <w:tc>
           <w:tcPr>
-            <w:tcW w:type="dxa" w:w="864"/>
+            <w:tcW w:type="dxa" w:w="720"/>
             <w:shd w:fill="F8FAFC"/>
             <w:tcMar>
               <w:top w:w="100" w:type="dxa"/>
@@ -8020,7 +8273,7 @@
         </w:tc>
         <w:tc>
           <w:tcPr>
-            <w:tcW w:type="dxa" w:w="4176"/>
+            <w:tcW w:type="dxa" w:w="2592"/>
             <w:shd w:fill="F8FAFC"/>
             <w:tcMar>
               <w:top w:w="100" w:type="dxa"/>
@@ -8039,13 +8292,13 @@
                 <w:color w:val="1E293B"/>
                 <w:sz w:val="20"/>
               </w:rPr>
-              <w:t>Hệ thống nhận kết quả tính toán thành công.</w:t>
-            </w:r>
-          </w:p>
-        </w:tc>
-        <w:tc>
-          <w:tcPr>
-            <w:tcW w:type="dxa" w:w="4320"/>
+              <w:t>Hệ thống thực hiện tính toán tài chính thành công và trả về RevenueSummaryDto.</w:t>
+            </w:r>
+          </w:p>
+        </w:tc>
+        <w:tc>
+          <w:tcPr>
+            <w:tcW w:type="dxa" w:w="1584"/>
             <w:shd w:fill="F8FAFC"/>
             <w:tcMar>
               <w:top w:w="100" w:type="dxa"/>
@@ -8064,7 +8317,57 @@
                 <w:color w:val="1E293B"/>
                 <w:sz w:val="20"/>
               </w:rPr>
-              <w:t>Giao diện cập nhật tức thì 4 thẻ KPI, kết xuất biểu đồ Donut tỷ trọng doanh thu bên trái và điền đầy đủ dữ liệu vào bảng chi tiết phân khu bên phải.</w:t>
+              <w:t>OnDataLoaded (Success Callback)</w:t>
+            </w:r>
+          </w:p>
+        </w:tc>
+        <w:tc>
+          <w:tcPr>
+            <w:tcW w:type="dxa" w:w="3312"/>
+            <w:shd w:fill="F8FAFC"/>
+            <w:tcMar>
+              <w:top w:w="100" w:type="dxa"/>
+              <w:bottom w:w="100" w:type="dxa"/>
+              <w:left w:w="140" w:type="dxa"/>
+              <w:right w:w="140" w:type="dxa"/>
+            </w:tcMar>
+          </w:tcPr>
+          <w:p>
+            <w:pPr>
+              <w:jc w:val="left"/>
+            </w:pPr>
+            <w:r>
+              <w:rPr>
+                <w:rFonts w:ascii="Times New Roman" w:hAnsi="Times New Roman"/>
+                <w:color w:val="1E293B"/>
+                <w:sz w:val="20"/>
+              </w:rPr>
+              <w:t>Ẩn biểu tượng xoay tải dữ liệu, kích hoạt lại bộ lọc. Nạp các giá trị số liệu vào 4 thẻ KPI; vẽ biểu đồ tròn Donut tỷ trọng phân khu; điền đầy đủ dữ liệu phân tích chi tiết vào bảng breakdown table.</w:t>
+            </w:r>
+          </w:p>
+        </w:tc>
+        <w:tc>
+          <w:tcPr>
+            <w:tcW w:type="dxa" w:w="1872"/>
+            <w:shd w:fill="F8FAFC"/>
+            <w:tcMar>
+              <w:top w:w="100" w:type="dxa"/>
+              <w:bottom w:w="100" w:type="dxa"/>
+              <w:left w:w="140" w:type="dxa"/>
+              <w:right w:w="140" w:type="dxa"/>
+            </w:tcMar>
+          </w:tcPr>
+          <w:p>
+            <w:pPr>
+              <w:jc w:val="left"/>
+            </w:pPr>
+            <w:r>
+              <w:rPr>
+                <w:rFonts w:ascii="Times New Roman" w:hAnsi="Times New Roman"/>
+                <w:color w:val="1E293B"/>
+                <w:sz w:val="20"/>
+              </w:rPr>
+              <w:t>Hiển thị báo cáo (Rendered): Toàn bộ số liệu doanh thu, biểu đồ phân khu và bảng phân tích chi tiết được hiển thị sắc nét.</w:t>
             </w:r>
           </w:p>
         </w:tc>
@@ -8072,7 +8375,7 @@
       <w:tr>
         <w:tc>
           <w:tcPr>
-            <w:tcW w:type="dxa" w:w="864"/>
+            <w:tcW w:type="dxa" w:w="720"/>
             <w:shd w:fill="FFFFFF"/>
             <w:tcMar>
               <w:top w:w="100" w:type="dxa"/>
@@ -8097,7 +8400,7 @@
         </w:tc>
         <w:tc>
           <w:tcPr>
-            <w:tcW w:type="dxa" w:w="4176"/>
+            <w:tcW w:type="dxa" w:w="2592"/>
             <w:shd w:fill="FFFFFF"/>
             <w:tcMar>
               <w:top w:w="100" w:type="dxa"/>
@@ -8116,13 +8419,13 @@
                 <w:color w:val="1E293B"/>
                 <w:sz w:val="20"/>
               </w:rPr>
-              <w:t>Người dùng rê chuột vào các phần của biểu đồ Donut.</w:t>
-            </w:r>
-          </w:p>
-        </w:tc>
-        <w:tc>
-          <w:tcPr>
-            <w:tcW w:type="dxa" w:w="4320"/>
+              <w:t>Người dùng di chuyển con trỏ chuột vào vùng phân khu 'VIP' trên biểu đồ tròn Donut.</w:t>
+            </w:r>
+          </w:p>
+        </w:tc>
+        <w:tc>
+          <w:tcPr>
+            <w:tcW w:type="dxa" w:w="1584"/>
             <w:shd w:fill="FFFFFF"/>
             <w:tcMar>
               <w:top w:w="100" w:type="dxa"/>
@@ -8141,7 +8444,57 @@
                 <w:color w:val="1E293B"/>
                 <w:sz w:val="20"/>
               </w:rPr>
-              <w:t>Hệ thống hiển thị tooltip chi tiết: Tên phân khu, doanh thu thu được và tỷ lệ phần trăm đóng góp.</w:t>
+              <w:t>OnMouseHover (chart_zone.VIP)</w:t>
+            </w:r>
+          </w:p>
+        </w:tc>
+        <w:tc>
+          <w:tcPr>
+            <w:tcW w:type="dxa" w:w="3312"/>
+            <w:shd w:fill="FFFFFF"/>
+            <w:tcMar>
+              <w:top w:w="100" w:type="dxa"/>
+              <w:bottom w:w="100" w:type="dxa"/>
+              <w:left w:w="140" w:type="dxa"/>
+              <w:right w:w="140" w:type="dxa"/>
+            </w:tcMar>
+          </w:tcPr>
+          <w:p>
+            <w:pPr>
+              <w:jc w:val="left"/>
+            </w:pPr>
+            <w:r>
+              <w:rPr>
+                <w:rFonts w:ascii="Times New Roman" w:hAnsi="Times New Roman"/>
+                <w:color w:val="1E293B"/>
+                <w:sz w:val="20"/>
+              </w:rPr>
+              <w:t>Biểu đồ Donut làm nổi bật khu vực VIP bằng hiệu ứng phóng to nhẹ (explode). Hệ thống hiển thị tooltip chi tiết: 'Phân khu: VIP | Doanh thu: 7.000.000.000đ | Tỷ trọng: 45.3%'.</w:t>
+            </w:r>
+          </w:p>
+        </w:tc>
+        <w:tc>
+          <w:tcPr>
+            <w:tcW w:type="dxa" w:w="1872"/>
+            <w:shd w:fill="FFFFFF"/>
+            <w:tcMar>
+              <w:top w:w="100" w:type="dxa"/>
+              <w:bottom w:w="100" w:type="dxa"/>
+              <w:left w:w="140" w:type="dxa"/>
+              <w:right w:w="140" w:type="dxa"/>
+            </w:tcMar>
+          </w:tcPr>
+          <w:p>
+            <w:pPr>
+              <w:jc w:val="left"/>
+            </w:pPr>
+            <w:r>
+              <w:rPr>
+                <w:rFonts w:ascii="Times New Roman" w:hAnsi="Times New Roman"/>
+                <w:color w:val="1E293B"/>
+                <w:sz w:val="20"/>
+              </w:rPr>
+              <w:t>Tương tác biểu đồ (Hovered): Tooltip chi tiết hiển thị động tại vị trí con trỏ chuột.</w:t>
             </w:r>
           </w:p>
         </w:tc>
@@ -8149,7 +8502,7 @@
       <w:tr>
         <w:tc>
           <w:tcPr>
-            <w:tcW w:type="dxa" w:w="864"/>
+            <w:tcW w:type="dxa" w:w="720"/>
             <w:shd w:fill="F8FAFC"/>
             <w:tcMar>
               <w:top w:w="100" w:type="dxa"/>
@@ -8174,7 +8527,7 @@
         </w:tc>
         <w:tc>
           <w:tcPr>
-            <w:tcW w:type="dxa" w:w="4176"/>
+            <w:tcW w:type="dxa" w:w="2592"/>
             <w:shd w:fill="F8FAFC"/>
             <w:tcMar>
               <w:top w:w="100" w:type="dxa"/>
@@ -8193,13 +8546,13 @@
                 <w:color w:val="1E293B"/>
                 <w:sz w:val="20"/>
               </w:rPr>
-              <w:t>Người dùng nhấp nút 'Xuất Excel' hoặc 'In PDF'.</w:t>
-            </w:r>
-          </w:p>
-        </w:tc>
-        <w:tc>
-          <w:tcPr>
-            <w:tcW w:type="dxa" w:w="4320"/>
+              <w:t>Người dùng nhấp chuột vào nút 'Xuất Excel' (btn_excel).</w:t>
+            </w:r>
+          </w:p>
+        </w:tc>
+        <w:tc>
+          <w:tcPr>
+            <w:tcW w:type="dxa" w:w="1584"/>
             <w:shd w:fill="F8FAFC"/>
             <w:tcMar>
               <w:top w:w="100" w:type="dxa"/>
@@ -8218,7 +8571,524 @@
                 <w:color w:val="1E293B"/>
                 <w:sz w:val="20"/>
               </w:rPr>
-              <w:t>Hệ thống gọi phương thức exportExcel()/exportPdf(), hiển thị hộp thoại tải tệp xuống máy tính của người dùng.</w:t>
+              <w:t>OnClick (btn_excel)</w:t>
+            </w:r>
+          </w:p>
+        </w:tc>
+        <w:tc>
+          <w:tcPr>
+            <w:tcW w:type="dxa" w:w="3312"/>
+            <w:shd w:fill="F8FAFC"/>
+            <w:tcMar>
+              <w:top w:w="100" w:type="dxa"/>
+              <w:bottom w:w="100" w:type="dxa"/>
+              <w:left w:w="140" w:type="dxa"/>
+              <w:right w:w="140" w:type="dxa"/>
+            </w:tcMar>
+          </w:tcPr>
+          <w:p>
+            <w:pPr>
+              <w:jc w:val="left"/>
+            </w:pPr>
+            <w:r>
+              <w:rPr>
+                <w:rFonts w:ascii="Times New Roman" w:hAnsi="Times New Roman"/>
+                <w:color w:val="1E293B"/>
+                <w:sz w:val="20"/>
+              </w:rPr>
+              <w:t>Giao diện gửi yêu cầu kết xuất tệp tới Controller. Hệ thống tạo luồng byte của file Excel, thiết lập MIME-type và hiển thị hộp thoại tải xuống tệp 'Báo_cáo_doanh_thu_BornPink_2026.xlsx'.</w:t>
+            </w:r>
+          </w:p>
+        </w:tc>
+        <w:tc>
+          <w:tcPr>
+            <w:tcW w:type="dxa" w:w="1872"/>
+            <w:shd w:fill="F8FAFC"/>
+            <w:tcMar>
+              <w:top w:w="100" w:type="dxa"/>
+              <w:bottom w:w="100" w:type="dxa"/>
+              <w:left w:w="140" w:type="dxa"/>
+              <w:right w:w="140" w:type="dxa"/>
+            </w:tcMar>
+          </w:tcPr>
+          <w:p>
+            <w:pPr>
+              <w:jc w:val="left"/>
+            </w:pPr>
+            <w:r>
+              <w:rPr>
+                <w:rFonts w:ascii="Times New Roman" w:hAnsi="Times New Roman"/>
+                <w:color w:val="1E293B"/>
+                <w:sz w:val="20"/>
+              </w:rPr>
+              <w:t>Hiển thị báo cáo (Rendered): Quá trình tải xuống tệp báo cáo hoàn tất trong nền.</w:t>
+            </w:r>
+          </w:p>
+        </w:tc>
+      </w:tr>
+    </w:tbl>
+    <w:p>
+      <w:pPr>
+        <w:spacing w:before="0" w:after="120"/>
+      </w:pPr>
+    </w:p>
+    <w:p>
+      <w:pPr>
+        <w:keepNext/>
+        <w:spacing w:before="160" w:after="60"/>
+      </w:pPr>
+      <w:r>
+        <w:rPr>
+          <w:rFonts w:ascii="Times New Roman" w:hAnsi="Times New Roman"/>
+          <w:b/>
+          <w:i/>
+          <w:color w:val="334155"/>
+          <w:sz w:val="23"/>
+        </w:rPr>
+        <w:t>4.2.1. Các kịch bản kiểm lỗi và ràng buộc giao diện (UI Validation Scenarios)</w:t>
+      </w:r>
+    </w:p>
+    <w:p>
+      <w:pPr>
+        <w:spacing w:before="0" w:after="100" w:line="300" w:lineRule="auto"/>
+      </w:pPr>
+      <w:r>
+        <w:rPr>
+          <w:rFonts w:ascii="Times New Roman" w:hAnsi="Times New Roman"/>
+          <w:color w:val="1E293B"/>
+          <w:sz w:val="23"/>
+        </w:rPr>
+        <w:t>Kịch bản xử lý các ngoại lệ và lỗi nhập liệu trên giao diện nhằm đảm bảo tính toàn vẹn của dữ liệu tra cứu và hướng dẫn người dùng sửa lỗi:</w:t>
+      </w:r>
+    </w:p>
+    <w:tbl>
+      <w:tblPr>
+        <w:tblW w:type="auto" w:w="0"/>
+        <w:jc w:val="center"/>
+        <w:tblLook w:firstColumn="1" w:firstRow="1" w:lastColumn="0" w:lastRow="0" w:noHBand="0" w:noVBand="1" w:val="04A0"/>
+        <w:tblBorders>
+          <w:top w:val="single" w:sz="6" w:space="0" w:color="CBD5E1"/>
+          <w:left w:val="none"/>
+          <w:bottom w:val="single" w:sz="8" w:space="0" w:color="1E3A8A"/>
+          <w:right w:val="none"/>
+          <w:insideH w:val="single" w:sz="4" w:space="0" w:color="CBD5E1"/>
+          <w:insideV w:val="none"/>
+        </w:tblBorders>
+      </w:tblPr>
+      <w:tblGrid>
+        <w:gridCol w:w="2351"/>
+        <w:gridCol w:w="2351"/>
+        <w:gridCol w:w="2351"/>
+        <w:gridCol w:w="2351"/>
+      </w:tblGrid>
+      <w:tr>
+        <w:tc>
+          <w:tcPr>
+            <w:tcW w:type="dxa" w:w="2160"/>
+            <w:shd w:fill="1E3A8A"/>
+            <w:tcMar>
+              <w:top w:w="140" w:type="dxa"/>
+              <w:bottom w:w="140" w:type="dxa"/>
+              <w:left w:w="160" w:type="dxa"/>
+              <w:right w:w="160" w:type="dxa"/>
+            </w:tcMar>
+          </w:tcPr>
+          <w:p>
+            <w:pPr>
+              <w:jc w:val="center"/>
+            </w:pPr>
+            <w:r>
+              <w:rPr>
+                <w:rFonts w:ascii="Times New Roman" w:hAnsi="Times New Roman"/>
+                <w:b/>
+                <w:color w:val="FFFFFF"/>
+                <w:sz w:val="21"/>
+              </w:rPr>
+              <w:t>Kịch bản ngoại lệ</w:t>
+            </w:r>
+          </w:p>
+        </w:tc>
+        <w:tc>
+          <w:tcPr>
+            <w:tcW w:type="dxa" w:w="1728"/>
+            <w:shd w:fill="1E3A8A"/>
+            <w:tcMar>
+              <w:top w:w="140" w:type="dxa"/>
+              <w:bottom w:w="140" w:type="dxa"/>
+              <w:left w:w="160" w:type="dxa"/>
+              <w:right w:w="160" w:type="dxa"/>
+            </w:tcMar>
+          </w:tcPr>
+          <w:p>
+            <w:pPr>
+              <w:jc w:val="center"/>
+            </w:pPr>
+            <w:r>
+              <w:rPr>
+                <w:rFonts w:ascii="Times New Roman" w:hAnsi="Times New Roman"/>
+                <w:b/>
+                <w:color w:val="FFFFFF"/>
+                <w:sz w:val="21"/>
+              </w:rPr>
+              <w:t>Sự kiện kích hoạt (UI Event)</w:t>
+            </w:r>
+          </w:p>
+        </w:tc>
+        <w:tc>
+          <w:tcPr>
+            <w:tcW w:type="dxa" w:w="3600"/>
+            <w:shd w:fill="1E3A8A"/>
+            <w:tcMar>
+              <w:top w:w="140" w:type="dxa"/>
+              <w:bottom w:w="140" w:type="dxa"/>
+              <w:left w:w="160" w:type="dxa"/>
+              <w:right w:w="160" w:type="dxa"/>
+            </w:tcMar>
+          </w:tcPr>
+          <w:p>
+            <w:pPr>
+              <w:jc w:val="center"/>
+            </w:pPr>
+            <w:r>
+              <w:rPr>
+                <w:rFonts w:ascii="Times New Roman" w:hAnsi="Times New Roman"/>
+                <w:b/>
+                <w:color w:val="FFFFFF"/>
+                <w:sz w:val="21"/>
+              </w:rPr>
+              <w:t>Xử lý lỗi &amp; Phản hồi giao diện (System Response)</w:t>
+            </w:r>
+          </w:p>
+        </w:tc>
+        <w:tc>
+          <w:tcPr>
+            <w:tcW w:type="dxa" w:w="1872"/>
+            <w:shd w:fill="1E3A8A"/>
+            <w:tcMar>
+              <w:top w:w="140" w:type="dxa"/>
+              <w:bottom w:w="140" w:type="dxa"/>
+              <w:left w:w="160" w:type="dxa"/>
+              <w:right w:w="160" w:type="dxa"/>
+            </w:tcMar>
+          </w:tcPr>
+          <w:p>
+            <w:pPr>
+              <w:jc w:val="center"/>
+            </w:pPr>
+            <w:r>
+              <w:rPr>
+                <w:rFonts w:ascii="Times New Roman" w:hAnsi="Times New Roman"/>
+                <w:b/>
+                <w:color w:val="FFFFFF"/>
+                <w:sz w:val="21"/>
+              </w:rPr>
+              <w:t>Trạng thái giao diện tiếp theo</w:t>
+            </w:r>
+          </w:p>
+        </w:tc>
+      </w:tr>
+      <w:tr>
+        <w:tc>
+          <w:tcPr>
+            <w:tcW w:type="dxa" w:w="2160"/>
+            <w:shd w:fill="FFFFFF"/>
+            <w:tcMar>
+              <w:top w:w="100" w:type="dxa"/>
+              <w:bottom w:w="100" w:type="dxa"/>
+              <w:left w:w="140" w:type="dxa"/>
+              <w:right w:w="140" w:type="dxa"/>
+            </w:tcMar>
+          </w:tcPr>
+          <w:p>
+            <w:pPr>
+              <w:jc w:val="center"/>
+            </w:pPr>
+            <w:r>
+              <w:rPr>
+                <w:rFonts w:ascii="Times New Roman" w:hAnsi="Times New Roman"/>
+                <w:color w:val="1E293B"/>
+                <w:sz w:val="20"/>
+              </w:rPr>
+              <w:t>Người dùng nhập ngày bắt đầu lớn hơn ngày kết thúc (dp_from_date &gt; dp_to_date)</w:t>
+            </w:r>
+          </w:p>
+        </w:tc>
+        <w:tc>
+          <w:tcPr>
+            <w:tcW w:type="dxa" w:w="1728"/>
+            <w:shd w:fill="FFFFFF"/>
+            <w:tcMar>
+              <w:top w:w="100" w:type="dxa"/>
+              <w:bottom w:w="100" w:type="dxa"/>
+              <w:left w:w="140" w:type="dxa"/>
+              <w:right w:w="140" w:type="dxa"/>
+            </w:tcMar>
+          </w:tcPr>
+          <w:p>
+            <w:pPr>
+              <w:jc w:val="left"/>
+            </w:pPr>
+            <w:r>
+              <w:rPr>
+                <w:rFonts w:ascii="Times New Roman" w:hAnsi="Times New Roman"/>
+                <w:color w:val="1E293B"/>
+                <w:sz w:val="20"/>
+              </w:rPr>
+              <w:t>OnClick (btn_search) sau khi sửa ô ngày</w:t>
+            </w:r>
+          </w:p>
+        </w:tc>
+        <w:tc>
+          <w:tcPr>
+            <w:tcW w:type="dxa" w:w="3600"/>
+            <w:shd w:fill="FFFFFF"/>
+            <w:tcMar>
+              <w:top w:w="100" w:type="dxa"/>
+              <w:bottom w:w="100" w:type="dxa"/>
+              <w:left w:w="140" w:type="dxa"/>
+              <w:right w:w="140" w:type="dxa"/>
+            </w:tcMar>
+          </w:tcPr>
+          <w:p>
+            <w:pPr>
+              <w:jc w:val="left"/>
+            </w:pPr>
+            <w:r>
+              <w:rPr>
+                <w:rFonts w:ascii="Times New Roman" w:hAnsi="Times New Roman"/>
+                <w:color w:val="1E293B"/>
+                <w:sz w:val="20"/>
+              </w:rPr>
+              <w:t>Giao diện ngăn chặn gửi yêu cầu tra cứu xuống Controller. Ô viền dp_from_date và dp_to_date chuyển sang màu đỏ cảnh báo. Hệ thống hiển thị hộp thoại pop-up: 'Lỗi: Ngày bắt đầu tra cứu không thể sau ngày kết thúc!'</w:t>
+            </w:r>
+          </w:p>
+        </w:tc>
+        <w:tc>
+          <w:tcPr>
+            <w:tcW w:type="dxa" w:w="1872"/>
+            <w:shd w:fill="FFFFFF"/>
+            <w:tcMar>
+              <w:top w:w="100" w:type="dxa"/>
+              <w:bottom w:w="100" w:type="dxa"/>
+              <w:left w:w="140" w:type="dxa"/>
+              <w:right w:w="140" w:type="dxa"/>
+            </w:tcMar>
+          </w:tcPr>
+          <w:p>
+            <w:pPr>
+              <w:jc w:val="left"/>
+            </w:pPr>
+            <w:r>
+              <w:rPr>
+                <w:rFonts w:ascii="Times New Roman" w:hAnsi="Times New Roman"/>
+                <w:color w:val="1E293B"/>
+                <w:sz w:val="20"/>
+              </w:rPr>
+              <w:t>Cảnh báo lỗi bộ lọc (Error State): Hộp thoại hiển thị nút 'Đóng', người dùng phải sửa lại ngày.</w:t>
+            </w:r>
+          </w:p>
+        </w:tc>
+      </w:tr>
+      <w:tr>
+        <w:tc>
+          <w:tcPr>
+            <w:tcW w:type="dxa" w:w="2160"/>
+            <w:shd w:fill="F8FAFC"/>
+            <w:tcMar>
+              <w:top w:w="100" w:type="dxa"/>
+              <w:bottom w:w="100" w:type="dxa"/>
+              <w:left w:w="140" w:type="dxa"/>
+              <w:right w:w="140" w:type="dxa"/>
+            </w:tcMar>
+          </w:tcPr>
+          <w:p>
+            <w:pPr>
+              <w:jc w:val="center"/>
+            </w:pPr>
+            <w:r>
+              <w:rPr>
+                <w:rFonts w:ascii="Times New Roman" w:hAnsi="Times New Roman"/>
+                <w:color w:val="1E293B"/>
+                <w:sz w:val="20"/>
+              </w:rPr>
+              <w:t>Sự kiện được chọn chưa phát sinh bất kỳ giao dịch bán vé nào</w:t>
+            </w:r>
+          </w:p>
+        </w:tc>
+        <w:tc>
+          <w:tcPr>
+            <w:tcW w:type="dxa" w:w="1728"/>
+            <w:shd w:fill="F8FAFC"/>
+            <w:tcMar>
+              <w:top w:w="100" w:type="dxa"/>
+              <w:bottom w:w="100" w:type="dxa"/>
+              <w:left w:w="140" w:type="dxa"/>
+              <w:right w:w="140" w:type="dxa"/>
+            </w:tcMar>
+          </w:tcPr>
+          <w:p>
+            <w:pPr>
+              <w:jc w:val="left"/>
+            </w:pPr>
+            <w:r>
+              <w:rPr>
+                <w:rFonts w:ascii="Times New Roman" w:hAnsi="Times New Roman"/>
+                <w:color w:val="1E293B"/>
+                <w:sz w:val="20"/>
+              </w:rPr>
+              <w:t>OnClick (btn_search) đối với sự kiện mới tạo</w:t>
+            </w:r>
+          </w:p>
+        </w:tc>
+        <w:tc>
+          <w:tcPr>
+            <w:tcW w:type="dxa" w:w="3600"/>
+            <w:shd w:fill="F8FAFC"/>
+            <w:tcMar>
+              <w:top w:w="100" w:type="dxa"/>
+              <w:bottom w:w="100" w:type="dxa"/>
+              <w:left w:w="140" w:type="dxa"/>
+              <w:right w:w="140" w:type="dxa"/>
+            </w:tcMar>
+          </w:tcPr>
+          <w:p>
+            <w:pPr>
+              <w:jc w:val="left"/>
+            </w:pPr>
+            <w:r>
+              <w:rPr>
+                <w:rFonts w:ascii="Times New Roman" w:hAnsi="Times New Roman"/>
+                <w:color w:val="1E293B"/>
+                <w:sz w:val="20"/>
+              </w:rPr>
+              <w:t>Controller trả về kết quả rỗng (empty result). Giao diện ẩn biểu đồ tròn và bảng breakdown table, đặt giá trị các thẻ KPI về '0 VNĐ' và '0%'. Hiển thị thông báo màu xám trên màn hình: 'Sự kiện hiện tại chưa phát sinh giao dịch bán vé.'</w:t>
+            </w:r>
+          </w:p>
+        </w:tc>
+        <w:tc>
+          <w:tcPr>
+            <w:tcW w:type="dxa" w:w="1872"/>
+            <w:shd w:fill="F8FAFC"/>
+            <w:tcMar>
+              <w:top w:w="100" w:type="dxa"/>
+              <w:bottom w:w="100" w:type="dxa"/>
+              <w:left w:w="140" w:type="dxa"/>
+              <w:right w:w="140" w:type="dxa"/>
+            </w:tcMar>
+          </w:tcPr>
+          <w:p>
+            <w:pPr>
+              <w:jc w:val="left"/>
+            </w:pPr>
+            <w:r>
+              <w:rPr>
+                <w:rFonts w:ascii="Times New Roman" w:hAnsi="Times New Roman"/>
+                <w:color w:val="1E293B"/>
+                <w:sz w:val="20"/>
+              </w:rPr>
+              <w:t>Báo cáo rỗng (No Data State): Bộ lọc giữ nguyên trạng thái hoạt động để người dùng chọn sự kiện khác.</w:t>
+            </w:r>
+          </w:p>
+        </w:tc>
+      </w:tr>
+      <w:tr>
+        <w:tc>
+          <w:tcPr>
+            <w:tcW w:type="dxa" w:w="2160"/>
+            <w:shd w:fill="FFFFFF"/>
+            <w:tcMar>
+              <w:top w:w="100" w:type="dxa"/>
+              <w:bottom w:w="100" w:type="dxa"/>
+              <w:left w:w="140" w:type="dxa"/>
+              <w:right w:w="140" w:type="dxa"/>
+            </w:tcMar>
+          </w:tcPr>
+          <w:p>
+            <w:pPr>
+              <w:jc w:val="center"/>
+            </w:pPr>
+            <w:r>
+              <w:rPr>
+                <w:rFonts w:ascii="Times New Roman" w:hAnsi="Times New Roman"/>
+                <w:color w:val="1E293B"/>
+                <w:sz w:val="20"/>
+              </w:rPr>
+              <w:t>Mất kết nối mạng hoặc máy chủ cơ sở dữ liệu gặp sự cố</w:t>
+            </w:r>
+          </w:p>
+        </w:tc>
+        <w:tc>
+          <w:tcPr>
+            <w:tcW w:type="dxa" w:w="1728"/>
+            <w:shd w:fill="FFFFFF"/>
+            <w:tcMar>
+              <w:top w:w="100" w:type="dxa"/>
+              <w:bottom w:w="100" w:type="dxa"/>
+              <w:left w:w="140" w:type="dxa"/>
+              <w:right w:w="140" w:type="dxa"/>
+            </w:tcMar>
+          </w:tcPr>
+          <w:p>
+            <w:pPr>
+              <w:jc w:val="left"/>
+            </w:pPr>
+            <w:r>
+              <w:rPr>
+                <w:rFonts w:ascii="Times New Roman" w:hAnsi="Times New Roman"/>
+                <w:color w:val="1E293B"/>
+                <w:sz w:val="20"/>
+              </w:rPr>
+              <w:t>OnClick (btn_search) khi mất tín hiệu</w:t>
+            </w:r>
+          </w:p>
+        </w:tc>
+        <w:tc>
+          <w:tcPr>
+            <w:tcW w:type="dxa" w:w="3600"/>
+            <w:shd w:fill="FFFFFF"/>
+            <w:tcMar>
+              <w:top w:w="100" w:type="dxa"/>
+              <w:bottom w:w="100" w:type="dxa"/>
+              <w:left w:w="140" w:type="dxa"/>
+              <w:right w:w="140" w:type="dxa"/>
+            </w:tcMar>
+          </w:tcPr>
+          <w:p>
+            <w:pPr>
+              <w:jc w:val="left"/>
+            </w:pPr>
+            <w:r>
+              <w:rPr>
+                <w:rFonts w:ascii="Times New Roman" w:hAnsi="Times New Roman"/>
+                <w:color w:val="1E293B"/>
+                <w:sz w:val="20"/>
+              </w:rPr>
+              <w:t>Hệ thống phát hiện lỗi kết nối (Timeout/Connection Refused). Giao diện ẩn loading spinner, hiển thị thông báo lỗi màu đỏ nổi bật: 'Mất kết nối tới máy chủ. Vui lòng kiểm tra lại đường truyền mạng hoặc liên hệ quản trị viên!'</w:t>
+            </w:r>
+          </w:p>
+        </w:tc>
+        <w:tc>
+          <w:tcPr>
+            <w:tcW w:type="dxa" w:w="1872"/>
+            <w:shd w:fill="FFFFFF"/>
+            <w:tcMar>
+              <w:top w:w="100" w:type="dxa"/>
+              <w:bottom w:w="100" w:type="dxa"/>
+              <w:left w:w="140" w:type="dxa"/>
+              <w:right w:w="140" w:type="dxa"/>
+            </w:tcMar>
+          </w:tcPr>
+          <w:p>
+            <w:pPr>
+              <w:jc w:val="left"/>
+            </w:pPr>
+            <w:r>
+              <w:rPr>
+                <w:rFonts w:ascii="Times New Roman" w:hAnsi="Times New Roman"/>
+                <w:color w:val="1E293B"/>
+                <w:sz w:val="20"/>
+              </w:rPr>
+              <w:t>Lỗi kết nối (Network Error): Giữ nguyên giao diện ban đầu để người dùng thử lại khi mạng ổn định.</w:t>
             </w:r>
           </w:p>
         </w:tc>

</xml_diff>